<commit_message>
fix: align submission artifacts with implementation
</commit_message>
<xml_diff>
--- a/documentation/ReadMe.docx
+++ b/documentation/ReadMe.docx
@@ -306,7 +306,7 @@
               <w:rPr>
                 <w:sz w:val="18"/>
               </w:rPr>
-              <w:t>Temporary income and expense entries with edit, delete, totals, balance, overspending warning, and reset</w:t>
+              <w:t>Separate sample monthly income plus dated expense records with edit, delete, totals, remaining amount, warning, and reset</w:t>
             </w:r>
           </w:p>
         </w:tc>
@@ -924,7 +924,7 @@
               <w:rPr>
                 <w:sz w:val="18"/>
               </w:rPr>
-              <w:t>Income 1200; expenses 200 and 350</w:t>
+              <w:t>Sample income 1200; dated expenses 200 and 350</w:t>
             </w:r>
           </w:p>
         </w:tc>
@@ -955,7 +955,7 @@
               <w:rPr>
                 <w:sz w:val="18"/>
               </w:rPr>
-              <w:t>Expenses 550, balance 650</w:t>
+              <w:t>Total expenses 550, remaining 650</w:t>
             </w:r>
           </w:p>
         </w:tc>
@@ -1627,11 +1627,6 @@
       <w:pPr>
         <w:spacing w:after="20"/>
       </w:pPr>
-    </w:p>
-    <w:p>
-      <w:r>
-        <w:br w:type="page"/>
-      </w:r>
     </w:p>
     <w:p>
       <w:pPr>

</xml_diff>

<commit_message>
docs: align project with canonical route tree
</commit_message>
<xml_diff>
--- a/documentation/ReadMe.docx
+++ b/documentation/ReadMe.docx
@@ -1722,62 +1722,20 @@
       <w:tr>
         <w:tc>
           <w:tcPr>
-            <w:tcW w:type="dxa" w:w="3240"/>
-            <w:vAlign w:val="center"/>
-            <w:tcBorders>
-              <w:top w:val="single" w:sz="4" w:color="D9D9D9"/>
-              <w:left w:val="single" w:sz="4" w:color="D9D9D9"/>
-              <w:bottom w:val="single" w:sz="4" w:color="D9D9D9"/>
-              <w:right w:val="single" w:sz="4" w:color="D9D9D9"/>
-              <w:insideH w:val="single" w:sz="4" w:color="D9D9D9"/>
-              <w:insideV w:val="single" w:sz="4" w:color="D9D9D9"/>
-            </w:tcBorders>
-            <w:tcMar>
-              <w:top w:w="90" w:type="dxa"/>
-              <w:start w:w="110" w:type="dxa"/>
-              <w:bottom w:w="90" w:type="dxa"/>
-              <w:end w:w="110" w:type="dxa"/>
-            </w:tcMar>
+            <w:tcW w:type="dxa" w:w="4968"/>
           </w:tcPr>
           <w:p>
-            <w:pPr>
-              <w:jc w:val="center"/>
-            </w:pPr>
             <w:r>
-              <w:rPr>
-                <w:sz w:val="18"/>
-              </w:rPr>
               <w:t>/</w:t>
             </w:r>
           </w:p>
         </w:tc>
         <w:tc>
           <w:tcPr>
-            <w:tcW w:type="dxa" w:w="6552"/>
-            <w:vAlign w:val="center"/>
-            <w:tcBorders>
-              <w:top w:val="single" w:sz="4" w:color="D9D9D9"/>
-              <w:left w:val="single" w:sz="4" w:color="D9D9D9"/>
-              <w:bottom w:val="single" w:sz="4" w:color="D9D9D9"/>
-              <w:right w:val="single" w:sz="4" w:color="D9D9D9"/>
-              <w:insideH w:val="single" w:sz="4" w:color="D9D9D9"/>
-              <w:insideV w:val="single" w:sz="4" w:color="D9D9D9"/>
-            </w:tcBorders>
-            <w:tcMar>
-              <w:top w:w="90" w:type="dxa"/>
-              <w:start w:w="110" w:type="dxa"/>
-              <w:bottom w:w="90" w:type="dxa"/>
-              <w:end w:w="110" w:type="dxa"/>
-            </w:tcMar>
+            <w:tcW w:type="dxa" w:w="4968"/>
           </w:tcPr>
           <w:p>
-            <w:pPr>
-              <w:jc w:val="left"/>
-            </w:pPr>
             <w:r>
-              <w:rPr>
-                <w:sz w:val="18"/>
-              </w:rPr>
               <w:t>Home and module entry points</w:t>
             </w:r>
           </w:p>
@@ -1786,64 +1744,20 @@
       <w:tr>
         <w:tc>
           <w:tcPr>
-            <w:tcW w:type="dxa" w:w="3240"/>
-            <w:shd w:fill="F3F7FA"/>
-            <w:vAlign w:val="center"/>
-            <w:tcBorders>
-              <w:top w:val="single" w:sz="4" w:color="D9D9D9"/>
-              <w:left w:val="single" w:sz="4" w:color="D9D9D9"/>
-              <w:bottom w:val="single" w:sz="4" w:color="D9D9D9"/>
-              <w:right w:val="single" w:sz="4" w:color="D9D9D9"/>
-              <w:insideH w:val="single" w:sz="4" w:color="D9D9D9"/>
-              <w:insideV w:val="single" w:sz="4" w:color="D9D9D9"/>
-            </w:tcBorders>
-            <w:tcMar>
-              <w:top w:w="90" w:type="dxa"/>
-              <w:start w:w="110" w:type="dxa"/>
-              <w:bottom w:w="90" w:type="dxa"/>
-              <w:end w:w="110" w:type="dxa"/>
-            </w:tcMar>
+            <w:tcW w:type="dxa" w:w="4968"/>
           </w:tcPr>
           <w:p>
-            <w:pPr>
-              <w:jc w:val="center"/>
-            </w:pPr>
             <w:r>
-              <w:rPr>
-                <w:sz w:val="18"/>
-              </w:rPr>
-              <w:t>/budgeting-basics</w:t>
+              <w:t>/learn/budgeting-basics</w:t>
             </w:r>
           </w:p>
         </w:tc>
         <w:tc>
           <w:tcPr>
-            <w:tcW w:type="dxa" w:w="6552"/>
-            <w:shd w:fill="F3F7FA"/>
-            <w:vAlign w:val="center"/>
-            <w:tcBorders>
-              <w:top w:val="single" w:sz="4" w:color="D9D9D9"/>
-              <w:left w:val="single" w:sz="4" w:color="D9D9D9"/>
-              <w:bottom w:val="single" w:sz="4" w:color="D9D9D9"/>
-              <w:right w:val="single" w:sz="4" w:color="D9D9D9"/>
-              <w:insideH w:val="single" w:sz="4" w:color="D9D9D9"/>
-              <w:insideV w:val="single" w:sz="4" w:color="D9D9D9"/>
-            </w:tcBorders>
-            <w:tcMar>
-              <w:top w:w="90" w:type="dxa"/>
-              <w:start w:w="110" w:type="dxa"/>
-              <w:bottom w:w="90" w:type="dxa"/>
-              <w:end w:w="110" w:type="dxa"/>
-            </w:tcMar>
+            <w:tcW w:type="dxa" w:w="4968"/>
           </w:tcPr>
           <w:p>
-            <w:pPr>
-              <w:jc w:val="left"/>
-            </w:pPr>
             <w:r>
-              <w:rPr>
-                <w:sz w:val="18"/>
-              </w:rPr>
               <w:t>Concepts and knowledge check</w:t>
             </w:r>
           </w:p>
@@ -1852,63 +1766,21 @@
       <w:tr>
         <w:tc>
           <w:tcPr>
-            <w:tcW w:type="dxa" w:w="3240"/>
-            <w:vAlign w:val="center"/>
-            <w:tcBorders>
-              <w:top w:val="single" w:sz="4" w:color="D9D9D9"/>
-              <w:left w:val="single" w:sz="4" w:color="D9D9D9"/>
-              <w:bottom w:val="single" w:sz="4" w:color="D9D9D9"/>
-              <w:right w:val="single" w:sz="4" w:color="D9D9D9"/>
-              <w:insideH w:val="single" w:sz="4" w:color="D9D9D9"/>
-              <w:insideV w:val="single" w:sz="4" w:color="D9D9D9"/>
-            </w:tcBorders>
-            <w:tcMar>
-              <w:top w:w="90" w:type="dxa"/>
-              <w:start w:w="110" w:type="dxa"/>
-              <w:bottom w:w="90" w:type="dxa"/>
-              <w:end w:w="110" w:type="dxa"/>
-            </w:tcMar>
+            <w:tcW w:type="dxa" w:w="4968"/>
           </w:tcPr>
           <w:p>
-            <w:pPr>
-              <w:jc w:val="center"/>
-            </w:pPr>
             <w:r>
-              <w:rPr>
-                <w:sz w:val="18"/>
-              </w:rPr>
-              <w:t>/needs-vs-wants</w:t>
+              <w:t>/learn/needs-vs-wants</w:t>
             </w:r>
           </w:p>
         </w:tc>
         <w:tc>
           <w:tcPr>
-            <w:tcW w:type="dxa" w:w="6552"/>
-            <w:vAlign w:val="center"/>
-            <w:tcBorders>
-              <w:top w:val="single" w:sz="4" w:color="D9D9D9"/>
-              <w:left w:val="single" w:sz="4" w:color="D9D9D9"/>
-              <w:bottom w:val="single" w:sz="4" w:color="D9D9D9"/>
-              <w:right w:val="single" w:sz="4" w:color="D9D9D9"/>
-              <w:insideH w:val="single" w:sz="4" w:color="D9D9D9"/>
-              <w:insideV w:val="single" w:sz="4" w:color="D9D9D9"/>
-            </w:tcBorders>
-            <w:tcMar>
-              <w:top w:w="90" w:type="dxa"/>
-              <w:start w:w="110" w:type="dxa"/>
-              <w:bottom w:w="90" w:type="dxa"/>
-              <w:end w:w="110" w:type="dxa"/>
-            </w:tcMar>
+            <w:tcW w:type="dxa" w:w="4968"/>
           </w:tcPr>
           <w:p>
-            <w:pPr>
-              <w:jc w:val="left"/>
-            </w:pPr>
             <w:r>
-              <w:rPr>
-                <w:sz w:val="18"/>
-              </w:rPr>
-              <w:t>Classification practice</w:t>
+              <w:t>Classification learning guide</w:t>
             </w:r>
           </w:p>
         </w:tc>
@@ -1916,65 +1788,21 @@
       <w:tr>
         <w:tc>
           <w:tcPr>
-            <w:tcW w:type="dxa" w:w="3240"/>
-            <w:shd w:fill="F3F7FA"/>
-            <w:vAlign w:val="center"/>
-            <w:tcBorders>
-              <w:top w:val="single" w:sz="4" w:color="D9D9D9"/>
-              <w:left w:val="single" w:sz="4" w:color="D9D9D9"/>
-              <w:bottom w:val="single" w:sz="4" w:color="D9D9D9"/>
-              <w:right w:val="single" w:sz="4" w:color="D9D9D9"/>
-              <w:insideH w:val="single" w:sz="4" w:color="D9D9D9"/>
-              <w:insideV w:val="single" w:sz="4" w:color="D9D9D9"/>
-            </w:tcBorders>
-            <w:tcMar>
-              <w:top w:w="90" w:type="dxa"/>
-              <w:start w:w="110" w:type="dxa"/>
-              <w:bottom w:w="90" w:type="dxa"/>
-              <w:end w:w="110" w:type="dxa"/>
-            </w:tcMar>
+            <w:tcW w:type="dxa" w:w="4968"/>
           </w:tcPr>
           <w:p>
-            <w:pPr>
-              <w:jc w:val="center"/>
-            </w:pPr>
             <w:r>
-              <w:rPr>
-                <w:sz w:val="18"/>
-              </w:rPr>
-              <w:t>/50-30-20</w:t>
+              <w:t>/learn/savings-goals</w:t>
             </w:r>
           </w:p>
         </w:tc>
         <w:tc>
           <w:tcPr>
-            <w:tcW w:type="dxa" w:w="6552"/>
-            <w:shd w:fill="F3F7FA"/>
-            <w:vAlign w:val="center"/>
-            <w:tcBorders>
-              <w:top w:val="single" w:sz="4" w:color="D9D9D9"/>
-              <w:left w:val="single" w:sz="4" w:color="D9D9D9"/>
-              <w:bottom w:val="single" w:sz="4" w:color="D9D9D9"/>
-              <w:right w:val="single" w:sz="4" w:color="D9D9D9"/>
-              <w:insideH w:val="single" w:sz="4" w:color="D9D9D9"/>
-              <w:insideV w:val="single" w:sz="4" w:color="D9D9D9"/>
-            </w:tcBorders>
-            <w:tcMar>
-              <w:top w:w="90" w:type="dxa"/>
-              <w:start w:w="110" w:type="dxa"/>
-              <w:bottom w:w="90" w:type="dxa"/>
-              <w:end w:w="110" w:type="dxa"/>
-            </w:tcMar>
+            <w:tcW w:type="dxa" w:w="4968"/>
           </w:tcPr>
           <w:p>
-            <w:pPr>
-              <w:jc w:val="left"/>
-            </w:pPr>
             <w:r>
-              <w:rPr>
-                <w:sz w:val="18"/>
-              </w:rPr>
-              <w:t>Budget allocation calculator</w:t>
+              <w:t>Savings goal learning guide</w:t>
             </w:r>
           </w:p>
         </w:tc>
@@ -1982,63 +1810,21 @@
       <w:tr>
         <w:tc>
           <w:tcPr>
-            <w:tcW w:type="dxa" w:w="3240"/>
-            <w:vAlign w:val="center"/>
-            <w:tcBorders>
-              <w:top w:val="single" w:sz="4" w:color="D9D9D9"/>
-              <w:left w:val="single" w:sz="4" w:color="D9D9D9"/>
-              <w:bottom w:val="single" w:sz="4" w:color="D9D9D9"/>
-              <w:right w:val="single" w:sz="4" w:color="D9D9D9"/>
-              <w:insideH w:val="single" w:sz="4" w:color="D9D9D9"/>
-              <w:insideV w:val="single" w:sz="4" w:color="D9D9D9"/>
-            </w:tcBorders>
-            <w:tcMar>
-              <w:top w:w="90" w:type="dxa"/>
-              <w:start w:w="110" w:type="dxa"/>
-              <w:bottom w:w="90" w:type="dxa"/>
-              <w:end w:w="110" w:type="dxa"/>
-            </w:tcMar>
+            <w:tcW w:type="dxa" w:w="4968"/>
           </w:tcPr>
           <w:p>
-            <w:pPr>
-              <w:jc w:val="center"/>
-            </w:pPr>
             <w:r>
-              <w:rPr>
-                <w:sz w:val="18"/>
-              </w:rPr>
-              <w:t>/savings-goals</w:t>
+              <w:t>/learn/expense-planner</w:t>
             </w:r>
           </w:p>
         </w:tc>
         <w:tc>
           <w:tcPr>
-            <w:tcW w:type="dxa" w:w="6552"/>
-            <w:vAlign w:val="center"/>
-            <w:tcBorders>
-              <w:top w:val="single" w:sz="4" w:color="D9D9D9"/>
-              <w:left w:val="single" w:sz="4" w:color="D9D9D9"/>
-              <w:bottom w:val="single" w:sz="4" w:color="D9D9D9"/>
-              <w:right w:val="single" w:sz="4" w:color="D9D9D9"/>
-              <w:insideH w:val="single" w:sz="4" w:color="D9D9D9"/>
-              <w:insideV w:val="single" w:sz="4" w:color="D9D9D9"/>
-            </w:tcBorders>
-            <w:tcMar>
-              <w:top w:w="90" w:type="dxa"/>
-              <w:start w:w="110" w:type="dxa"/>
-              <w:bottom w:w="90" w:type="dxa"/>
-              <w:end w:w="110" w:type="dxa"/>
-            </w:tcMar>
+            <w:tcW w:type="dxa" w:w="4968"/>
           </w:tcPr>
           <w:p>
-            <w:pPr>
-              <w:jc w:val="left"/>
-            </w:pPr>
             <w:r>
-              <w:rPr>
-                <w:sz w:val="18"/>
-              </w:rPr>
-              <w:t>Savings progress and timeline</w:t>
+              <w:t>Expense planning learning guide</w:t>
             </w:r>
           </w:p>
         </w:tc>
@@ -2046,64 +1832,64 @@
       <w:tr>
         <w:tc>
           <w:tcPr>
-            <w:tcW w:type="dxa" w:w="3240"/>
-            <w:shd w:fill="F3F7FA"/>
-            <w:vAlign w:val="center"/>
-            <w:tcBorders>
-              <w:top w:val="single" w:sz="4" w:color="D9D9D9"/>
-              <w:left w:val="single" w:sz="4" w:color="D9D9D9"/>
-              <w:bottom w:val="single" w:sz="4" w:color="D9D9D9"/>
-              <w:right w:val="single" w:sz="4" w:color="D9D9D9"/>
-              <w:insideH w:val="single" w:sz="4" w:color="D9D9D9"/>
-              <w:insideV w:val="single" w:sz="4" w:color="D9D9D9"/>
-            </w:tcBorders>
-            <w:tcMar>
-              <w:top w:w="90" w:type="dxa"/>
-              <w:start w:w="110" w:type="dxa"/>
-              <w:bottom w:w="90" w:type="dxa"/>
-              <w:end w:w="110" w:type="dxa"/>
-            </w:tcMar>
+            <w:tcW w:type="dxa" w:w="4968"/>
           </w:tcPr>
           <w:p>
-            <w:pPr>
-              <w:jc w:val="center"/>
-            </w:pPr>
             <w:r>
-              <w:rPr>
-                <w:sz w:val="18"/>
-              </w:rPr>
-              <w:t>/expense-planner</w:t>
+              <w:t>/learn/money-mistakes</w:t>
             </w:r>
           </w:p>
         </w:tc>
         <w:tc>
           <w:tcPr>
-            <w:tcW w:type="dxa" w:w="6552"/>
-            <w:shd w:fill="F3F7FA"/>
-            <w:vAlign w:val="center"/>
-            <w:tcBorders>
-              <w:top w:val="single" w:sz="4" w:color="D9D9D9"/>
-              <w:left w:val="single" w:sz="4" w:color="D9D9D9"/>
-              <w:bottom w:val="single" w:sz="4" w:color="D9D9D9"/>
-              <w:right w:val="single" w:sz="4" w:color="D9D9D9"/>
-              <w:insideH w:val="single" w:sz="4" w:color="D9D9D9"/>
-              <w:insideV w:val="single" w:sz="4" w:color="D9D9D9"/>
-            </w:tcBorders>
-            <w:tcMar>
-              <w:top w:w="90" w:type="dxa"/>
-              <w:start w:w="110" w:type="dxa"/>
-              <w:bottom w:w="90" w:type="dxa"/>
-              <w:end w:w="110" w:type="dxa"/>
-            </w:tcMar>
+            <w:tcW w:type="dxa" w:w="4968"/>
           </w:tcPr>
           <w:p>
-            <w:pPr>
-              <w:jc w:val="left"/>
-            </w:pPr>
             <w:r>
-              <w:rPr>
-                <w:sz w:val="18"/>
-              </w:rPr>
+              <w:t>Scenarios and corrective actions</w:t>
+            </w:r>
+          </w:p>
+        </w:tc>
+      </w:tr>
+      <w:tr>
+        <w:tc>
+          <w:tcPr>
+            <w:tcW w:type="dxa" w:w="4968"/>
+          </w:tcPr>
+          <w:p>
+            <w:r>
+              <w:t>/practice/savings-goals</w:t>
+            </w:r>
+          </w:p>
+        </w:tc>
+        <w:tc>
+          <w:tcPr>
+            <w:tcW w:type="dxa" w:w="4968"/>
+          </w:tcPr>
+          <w:p>
+            <w:r>
+              <w:t>Savings progress and timeline calculator</w:t>
+            </w:r>
+          </w:p>
+        </w:tc>
+      </w:tr>
+      <w:tr>
+        <w:tc>
+          <w:tcPr>
+            <w:tcW w:type="dxa" w:w="4968"/>
+          </w:tcPr>
+          <w:p>
+            <w:r>
+              <w:t>/practice/expense-planner</w:t>
+            </w:r>
+          </w:p>
+        </w:tc>
+        <w:tc>
+          <w:tcPr>
+            <w:tcW w:type="dxa" w:w="4968"/>
+          </w:tcPr>
+          <w:p>
+            <w:r>
               <w:t>Temporary income and expense planner</w:t>
             </w:r>
           </w:p>
@@ -2112,63 +1898,21 @@
       <w:tr>
         <w:tc>
           <w:tcPr>
-            <w:tcW w:type="dxa" w:w="3240"/>
-            <w:vAlign w:val="center"/>
-            <w:tcBorders>
-              <w:top w:val="single" w:sz="4" w:color="D9D9D9"/>
-              <w:left w:val="single" w:sz="4" w:color="D9D9D9"/>
-              <w:bottom w:val="single" w:sz="4" w:color="D9D9D9"/>
-              <w:right w:val="single" w:sz="4" w:color="D9D9D9"/>
-              <w:insideH w:val="single" w:sz="4" w:color="D9D9D9"/>
-              <w:insideV w:val="single" w:sz="4" w:color="D9D9D9"/>
-            </w:tcBorders>
-            <w:tcMar>
-              <w:top w:w="90" w:type="dxa"/>
-              <w:start w:w="110" w:type="dxa"/>
-              <w:bottom w:w="90" w:type="dxa"/>
-              <w:end w:w="110" w:type="dxa"/>
-            </w:tcMar>
+            <w:tcW w:type="dxa" w:w="4968"/>
           </w:tcPr>
           <w:p>
-            <w:pPr>
-              <w:jc w:val="center"/>
-            </w:pPr>
             <w:r>
-              <w:rPr>
-                <w:sz w:val="18"/>
-              </w:rPr>
-              <w:t>/money-mistakes</w:t>
+              <w:t>/practice/money-mistakes</w:t>
             </w:r>
           </w:p>
         </w:tc>
         <w:tc>
           <w:tcPr>
-            <w:tcW w:type="dxa" w:w="6552"/>
-            <w:vAlign w:val="center"/>
-            <w:tcBorders>
-              <w:top w:val="single" w:sz="4" w:color="D9D9D9"/>
-              <w:left w:val="single" w:sz="4" w:color="D9D9D9"/>
-              <w:bottom w:val="single" w:sz="4" w:color="D9D9D9"/>
-              <w:right w:val="single" w:sz="4" w:color="D9D9D9"/>
-              <w:insideH w:val="single" w:sz="4" w:color="D9D9D9"/>
-              <w:insideV w:val="single" w:sz="4" w:color="D9D9D9"/>
-            </w:tcBorders>
-            <w:tcMar>
-              <w:top w:w="90" w:type="dxa"/>
-              <w:start w:w="110" w:type="dxa"/>
-              <w:bottom w:w="90" w:type="dxa"/>
-              <w:end w:w="110" w:type="dxa"/>
-            </w:tcMar>
+            <w:tcW w:type="dxa" w:w="4968"/>
           </w:tcPr>
           <w:p>
-            <w:pPr>
-              <w:jc w:val="left"/>
-            </w:pPr>
             <w:r>
-              <w:rPr>
-                <w:sz w:val="18"/>
-              </w:rPr>
-              <w:t>Scenarios and corrective actions</w:t>
+              <w:t>Interactive money-mistake practice</w:t>
             </w:r>
           </w:p>
         </w:tc>
@@ -2176,64 +1920,20 @@
       <w:tr>
         <w:tc>
           <w:tcPr>
-            <w:tcW w:type="dxa" w:w="3240"/>
-            <w:shd w:fill="F3F7FA"/>
-            <w:vAlign w:val="center"/>
-            <w:tcBorders>
-              <w:top w:val="single" w:sz="4" w:color="D9D9D9"/>
-              <w:left w:val="single" w:sz="4" w:color="D9D9D9"/>
-              <w:bottom w:val="single" w:sz="4" w:color="D9D9D9"/>
-              <w:right w:val="single" w:sz="4" w:color="D9D9D9"/>
-              <w:insideH w:val="single" w:sz="4" w:color="D9D9D9"/>
-              <w:insideV w:val="single" w:sz="4" w:color="D9D9D9"/>
-            </w:tcBorders>
-            <w:tcMar>
-              <w:top w:w="90" w:type="dxa"/>
-              <w:start w:w="110" w:type="dxa"/>
-              <w:bottom w:w="90" w:type="dxa"/>
-              <w:end w:w="110" w:type="dxa"/>
-            </w:tcMar>
+            <w:tcW w:type="dxa" w:w="4968"/>
           </w:tcPr>
           <w:p>
-            <w:pPr>
-              <w:jc w:val="center"/>
-            </w:pPr>
             <w:r>
-              <w:rPr>
-                <w:sz w:val="18"/>
-              </w:rPr>
-              <w:t>/infographics</w:t>
+              <w:t>/resources/infographics</w:t>
             </w:r>
           </w:p>
         </w:tc>
         <w:tc>
           <w:tcPr>
-            <w:tcW w:type="dxa" w:w="6552"/>
-            <w:shd w:fill="F3F7FA"/>
-            <w:vAlign w:val="center"/>
-            <w:tcBorders>
-              <w:top w:val="single" w:sz="4" w:color="D9D9D9"/>
-              <w:left w:val="single" w:sz="4" w:color="D9D9D9"/>
-              <w:bottom w:val="single" w:sz="4" w:color="D9D9D9"/>
-              <w:right w:val="single" w:sz="4" w:color="D9D9D9"/>
-              <w:insideH w:val="single" w:sz="4" w:color="D9D9D9"/>
-              <w:insideV w:val="single" w:sz="4" w:color="D9D9D9"/>
-            </w:tcBorders>
-            <w:tcMar>
-              <w:top w:w="90" w:type="dxa"/>
-              <w:start w:w="110" w:type="dxa"/>
-              <w:bottom w:w="90" w:type="dxa"/>
-              <w:end w:w="110" w:type="dxa"/>
-            </w:tcMar>
+            <w:tcW w:type="dxa" w:w="4968"/>
           </w:tcPr>
           <w:p>
-            <w:pPr>
-              <w:jc w:val="left"/>
-            </w:pPr>
             <w:r>
-              <w:rPr>
-                <w:sz w:val="18"/>
-              </w:rPr>
               <w:t>Searchable visual content</w:t>
             </w:r>
           </w:p>
@@ -2242,62 +1942,64 @@
       <w:tr>
         <w:tc>
           <w:tcPr>
-            <w:tcW w:type="dxa" w:w="3240"/>
-            <w:vAlign w:val="center"/>
-            <w:tcBorders>
-              <w:top w:val="single" w:sz="4" w:color="D9D9D9"/>
-              <w:left w:val="single" w:sz="4" w:color="D9D9D9"/>
-              <w:bottom w:val="single" w:sz="4" w:color="D9D9D9"/>
-              <w:right w:val="single" w:sz="4" w:color="D9D9D9"/>
-              <w:insideH w:val="single" w:sz="4" w:color="D9D9D9"/>
-              <w:insideV w:val="single" w:sz="4" w:color="D9D9D9"/>
-            </w:tcBorders>
-            <w:tcMar>
-              <w:top w:w="90" w:type="dxa"/>
-              <w:start w:w="110" w:type="dxa"/>
-              <w:bottom w:w="90" w:type="dxa"/>
-              <w:end w:w="110" w:type="dxa"/>
-            </w:tcMar>
+            <w:tcW w:type="dxa" w:w="4968"/>
           </w:tcPr>
           <w:p>
-            <w:pPr>
-              <w:jc w:val="center"/>
-            </w:pPr>
             <w:r>
-              <w:rPr>
-                <w:sz w:val="18"/>
-              </w:rPr>
+              <w:t>/resources/search</w:t>
+            </w:r>
+          </w:p>
+        </w:tc>
+        <w:tc>
+          <w:tcPr>
+            <w:tcW w:type="dxa" w:w="4968"/>
+          </w:tcPr>
+          <w:p>
+            <w:r>
+              <w:t>Resource search, sorting, and filters</w:t>
+            </w:r>
+          </w:p>
+        </w:tc>
+      </w:tr>
+      <w:tr>
+        <w:tc>
+          <w:tcPr>
+            <w:tcW w:type="dxa" w:w="4968"/>
+          </w:tcPr>
+          <w:p>
+            <w:r>
+              <w:t>/budget-calculator</w:t>
+            </w:r>
+          </w:p>
+        </w:tc>
+        <w:tc>
+          <w:tcPr>
+            <w:tcW w:type="dxa" w:w="4968"/>
+          </w:tcPr>
+          <w:p>
+            <w:r>
+              <w:t>50/30/20 budget allocation calculator</w:t>
+            </w:r>
+          </w:p>
+        </w:tc>
+      </w:tr>
+      <w:tr>
+        <w:tc>
+          <w:tcPr>
+            <w:tcW w:type="dxa" w:w="4968"/>
+          </w:tcPr>
+          <w:p>
+            <w:r>
               <w:t>/chatbot</w:t>
             </w:r>
           </w:p>
         </w:tc>
         <w:tc>
           <w:tcPr>
-            <w:tcW w:type="dxa" w:w="6552"/>
-            <w:vAlign w:val="center"/>
-            <w:tcBorders>
-              <w:top w:val="single" w:sz="4" w:color="D9D9D9"/>
-              <w:left w:val="single" w:sz="4" w:color="D9D9D9"/>
-              <w:bottom w:val="single" w:sz="4" w:color="D9D9D9"/>
-              <w:right w:val="single" w:sz="4" w:color="D9D9D9"/>
-              <w:insideH w:val="single" w:sz="4" w:color="D9D9D9"/>
-              <w:insideV w:val="single" w:sz="4" w:color="D9D9D9"/>
-            </w:tcBorders>
-            <w:tcMar>
-              <w:top w:w="90" w:type="dxa"/>
-              <w:start w:w="110" w:type="dxa"/>
-              <w:bottom w:w="90" w:type="dxa"/>
-              <w:end w:w="110" w:type="dxa"/>
-            </w:tcMar>
+            <w:tcW w:type="dxa" w:w="4968"/>
           </w:tcPr>
           <w:p>
-            <w:pPr>
-              <w:jc w:val="left"/>
-            </w:pPr>
             <w:r>
-              <w:rPr>
-                <w:sz w:val="18"/>
-              </w:rPr>
               <w:t>Prepared local finance answers</w:t>
             </w:r>
           </w:p>
@@ -2306,64 +2008,20 @@
       <w:tr>
         <w:tc>
           <w:tcPr>
-            <w:tcW w:type="dxa" w:w="3240"/>
-            <w:shd w:fill="F3F7FA"/>
-            <w:vAlign w:val="center"/>
-            <w:tcBorders>
-              <w:top w:val="single" w:sz="4" w:color="D9D9D9"/>
-              <w:left w:val="single" w:sz="4" w:color="D9D9D9"/>
-              <w:bottom w:val="single" w:sz="4" w:color="D9D9D9"/>
-              <w:right w:val="single" w:sz="4" w:color="D9D9D9"/>
-              <w:insideH w:val="single" w:sz="4" w:color="D9D9D9"/>
-              <w:insideV w:val="single" w:sz="4" w:color="D9D9D9"/>
-            </w:tcBorders>
-            <w:tcMar>
-              <w:top w:w="90" w:type="dxa"/>
-              <w:start w:w="110" w:type="dxa"/>
-              <w:bottom w:w="90" w:type="dxa"/>
-              <w:end w:w="110" w:type="dxa"/>
-            </w:tcMar>
+            <w:tcW w:type="dxa" w:w="4968"/>
           </w:tcPr>
           <w:p>
-            <w:pPr>
-              <w:jc w:val="center"/>
-            </w:pPr>
             <w:r>
-              <w:rPr>
-                <w:sz w:val="18"/>
-              </w:rPr>
               <w:t>/about, /feedback, /contact</w:t>
             </w:r>
           </w:p>
         </w:tc>
         <w:tc>
           <w:tcPr>
-            <w:tcW w:type="dxa" w:w="6552"/>
-            <w:shd w:fill="F3F7FA"/>
-            <w:vAlign w:val="center"/>
-            <w:tcBorders>
-              <w:top w:val="single" w:sz="4" w:color="D9D9D9"/>
-              <w:left w:val="single" w:sz="4" w:color="D9D9D9"/>
-              <w:bottom w:val="single" w:sz="4" w:color="D9D9D9"/>
-              <w:right w:val="single" w:sz="4" w:color="D9D9D9"/>
-              <w:insideH w:val="single" w:sz="4" w:color="D9D9D9"/>
-              <w:insideV w:val="single" w:sz="4" w:color="D9D9D9"/>
-            </w:tcBorders>
-            <w:tcMar>
-              <w:top w:w="90" w:type="dxa"/>
-              <w:start w:w="110" w:type="dxa"/>
-              <w:bottom w:w="90" w:type="dxa"/>
-              <w:end w:w="110" w:type="dxa"/>
-            </w:tcMar>
+            <w:tcW w:type="dxa" w:w="4968"/>
           </w:tcPr>
           <w:p>
-            <w:pPr>
-              <w:jc w:val="left"/>
-            </w:pPr>
             <w:r>
-              <w:rPr>
-                <w:sz w:val="18"/>
-              </w:rPr>
               <w:t>Project and support pages</w:t>
             </w:r>
           </w:p>
@@ -2372,63 +2030,21 @@
       <w:tr>
         <w:tc>
           <w:tcPr>
-            <w:tcW w:type="dxa" w:w="3240"/>
-            <w:vAlign w:val="center"/>
-            <w:tcBorders>
-              <w:top w:val="single" w:sz="4" w:color="D9D9D9"/>
-              <w:left w:val="single" w:sz="4" w:color="D9D9D9"/>
-              <w:bottom w:val="single" w:sz="4" w:color="D9D9D9"/>
-              <w:right w:val="single" w:sz="4" w:color="D9D9D9"/>
-              <w:insideH w:val="single" w:sz="4" w:color="D9D9D9"/>
-              <w:insideV w:val="single" w:sz="4" w:color="D9D9D9"/>
-            </w:tcBorders>
-            <w:tcMar>
-              <w:top w:w="90" w:type="dxa"/>
-              <w:start w:w="110" w:type="dxa"/>
-              <w:bottom w:w="90" w:type="dxa"/>
-              <w:end w:w="110" w:type="dxa"/>
-            </w:tcMar>
+            <w:tcW w:type="dxa" w:w="4968"/>
           </w:tcPr>
           <w:p>
-            <w:pPr>
-              <w:jc w:val="center"/>
-            </w:pPr>
             <w:r>
-              <w:rPr>
-                <w:sz w:val="18"/>
-              </w:rPr>
-              <w:t>/search, /sitemap, /privacy</w:t>
+              <w:t>/sitemap, /privacy</w:t>
             </w:r>
           </w:p>
         </w:tc>
         <w:tc>
           <w:tcPr>
-            <w:tcW w:type="dxa" w:w="6552"/>
-            <w:vAlign w:val="center"/>
-            <w:tcBorders>
-              <w:top w:val="single" w:sz="4" w:color="D9D9D9"/>
-              <w:left w:val="single" w:sz="4" w:color="D9D9D9"/>
-              <w:bottom w:val="single" w:sz="4" w:color="D9D9D9"/>
-              <w:right w:val="single" w:sz="4" w:color="D9D9D9"/>
-              <w:insideH w:val="single" w:sz="4" w:color="D9D9D9"/>
-              <w:insideV w:val="single" w:sz="4" w:color="D9D9D9"/>
-            </w:tcBorders>
-            <w:tcMar>
-              <w:top w:w="90" w:type="dxa"/>
-              <w:start w:w="110" w:type="dxa"/>
-              <w:bottom w:w="90" w:type="dxa"/>
-              <w:end w:w="110" w:type="dxa"/>
-            </w:tcMar>
+            <w:tcW w:type="dxa" w:w="4968"/>
           </w:tcPr>
           <w:p>
-            <w:pPr>
-              <w:jc w:val="left"/>
-            </w:pPr>
             <w:r>
-              <w:rPr>
-                <w:sz w:val="18"/>
-              </w:rPr>
-              <w:t>Discovery and policy pages</w:t>
+              <w:t>Route index and privacy notice</w:t>
             </w:r>
           </w:p>
         </w:tc>

</xml_diff>